<commit_message>
Add live 2025/26 simulation, chip strategy, and feature ablations
</commit_message>
<xml_diff>
--- a/FINAL_REPORT.docx
+++ b/FINAL_REPORT.docx
@@ -452,7 +452,6 @@
           <w:kern w:val="28"/>
           <w:szCs w:val="24"/>
         </w:rPr>
-        <w:lastRenderedPageBreak/>
         <w:t xml:space="preserve">The main objective of feature engineering was to create useful inputs while avoiding data leakage. All features were built using only information that would have been available before each </w:t>
       </w:r>
       <w:proofErr w:type="spellStart"/>
@@ -496,6 +495,7 @@
           <w:kern w:val="28"/>
           <w:szCs w:val="24"/>
         </w:rPr>
+        <w:lastRenderedPageBreak/>
         <w:t>The dataset includes features describing player form, team strength, opponent strength, fixture information, and market-related statistics. Examples include rolling averages of points, goals, assists, minutes played, expected goals, expected assists, ownership percentage, and transfer activity.</w:t>
       </w:r>
     </w:p>
@@ -705,6 +705,7 @@
         </w:rPr>
         <w:t xml:space="preserve">, </w:t>
       </w:r>
+      <w:proofErr w:type="gramStart"/>
       <w:r>
         <w:rPr>
           <w:rFonts w:asciiTheme="majorHAnsi" w:eastAsiaTheme="majorEastAsia" w:hAnsiTheme="majorHAnsi" w:cstheme="majorBidi"/>
@@ -713,7 +714,18 @@
           <w:kern w:val="28"/>
           <w:szCs w:val="24"/>
         </w:rPr>
-        <w:t>Rolling five-</w:t>
+        <w:t>Rolling</w:t>
+      </w:r>
+      <w:proofErr w:type="gramEnd"/>
+      <w:r>
+        <w:rPr>
+          <w:rFonts w:asciiTheme="majorHAnsi" w:eastAsiaTheme="majorEastAsia" w:hAnsiTheme="majorHAnsi" w:cstheme="majorBidi"/>
+          <w:color w:val="000000" w:themeColor="text1"/>
+          <w:spacing w:val="5"/>
+          <w:kern w:val="28"/>
+          <w:szCs w:val="24"/>
+        </w:rPr>
+        <w:t xml:space="preserve"> five-</w:t>
       </w:r>
       <w:proofErr w:type="spellStart"/>
       <w:r>
@@ -949,7 +961,6 @@
           <w:sz w:val="32"/>
           <w:szCs w:val="32"/>
         </w:rPr>
-        <w:lastRenderedPageBreak/>
         <w:t>Results</w:t>
       </w:r>
     </w:p>
@@ -998,6 +1009,7 @@
           <w:kern w:val="28"/>
           <w:szCs w:val="24"/>
         </w:rPr>
+        <w:lastRenderedPageBreak/>
         <w:t>Table 1.</w:t>
       </w:r>
       <w:r>
@@ -1916,16 +1928,833 @@
       </w:r>
     </w:p>
     <w:p>
-      <w:pPr>
+      <w:r>
         <w:rPr>
-          <w:color w:val="000000" w:themeColor="text1"/>
-          <w:szCs w:val="24"/>
+          <w:b/>
+          <w:sz w:val="32"/>
         </w:rPr>
-      </w:pPr>
+        <w:t>5. Squad Optimization</w:t>
+      </w:r>
+    </w:p>
+    <w:p>
+      <w:r>
+        <w:t>Once a model produces per-player point predictions, the system must turn those predictions into a legal Fantasy Premier League team. We formulated this as an Integer Linear Program solved with PuLP, encoding every FPL constraint: a £100m budget, a 15-man squad of exactly 2 GK / 5 DEF / 5 MID / 3 FWD, a valid starting eleven, captain doubling, and at most three players per club. Three modes were compared on the 2024/25 validation season: a fresh-squad upper bound (no transfer limits, picks the best XI each week), a greedy single-gameweek mode (2025/26 transfer rules — one free transfer, up to five banked, -4 per extra), and a 4-gameweek horizon mode that plans transfers over a rolling window via a multi-period ILP but only commits the first week's decision.</w:t>
+      </w:r>
+    </w:p>
+    <w:p>
+      <w:r>
+        <w:rPr>
+          <w:i/>
+        </w:rPr>
+        <w:t>Table 2. 2024/25 Validation Backtest Results.</w:t>
+      </w:r>
+    </w:p>
+    <w:tbl>
+      <w:tblPr>
+        <w:tblW w:w="0" w:type="auto"/>
+        <w:jc w:val="center"/>
+        <w:tblLook w:val="04A0" w:firstRow="1" w:lastRow="0" w:firstColumn="1" w:lastColumn="0" w:noHBand="0" w:noVBand="1"/>
+      </w:tblPr>
+      <w:tblGrid>
+        <w:gridCol w:w="3120"/>
+        <w:gridCol w:w="3120"/>
+        <w:gridCol w:w="3120"/>
+      </w:tblGrid>
+      <w:tr>
+        <w:trPr>
+          <w:jc w:val="center"/>
+        </w:trPr>
+        <w:tc>
+          <w:tcPr>
+            <w:tcW w:w="3120" w:type="dxa"/>
+          </w:tcPr>
+          <w:p>
+            <w:r>
+              <w:rPr>
+                <w:b/>
+              </w:rPr>
+              <w:t>Optimizer mode</w:t>
+            </w:r>
+          </w:p>
+        </w:tc>
+        <w:tc>
+          <w:tcPr>
+            <w:tcW w:w="3120" w:type="dxa"/>
+          </w:tcPr>
+          <w:p>
+            <w:r>
+              <w:rPr>
+                <w:b/>
+              </w:rPr>
+              <w:t>Net total</w:t>
+            </w:r>
+          </w:p>
+        </w:tc>
+        <w:tc>
+          <w:tcPr>
+            <w:tcW w:w="3120" w:type="dxa"/>
+          </w:tcPr>
+          <w:p>
+            <w:r>
+              <w:rPr>
+                <w:b/>
+              </w:rPr>
+              <w:t>Per GW</w:t>
+            </w:r>
+          </w:p>
+        </w:tc>
+      </w:tr>
+      <w:tr>
+        <w:trPr>
+          <w:jc w:val="center"/>
+        </w:trPr>
+        <w:tc>
+          <w:tcPr>
+            <w:tcW w:w="3120" w:type="dxa"/>
+          </w:tcPr>
+          <w:p>
+            <w:r>
+              <w:t>Fresh squad (upper bound)</w:t>
+            </w:r>
+          </w:p>
+        </w:tc>
+        <w:tc>
+          <w:tcPr>
+            <w:tcW w:w="3120" w:type="dxa"/>
+          </w:tcPr>
+          <w:p>
+            <w:r>
+              <w:t>2,830</w:t>
+            </w:r>
+          </w:p>
+        </w:tc>
+        <w:tc>
+          <w:tcPr>
+            <w:tcW w:w="3120" w:type="dxa"/>
+          </w:tcPr>
+          <w:p>
+            <w:r>
+              <w:t>74.5</w:t>
+            </w:r>
+          </w:p>
+        </w:tc>
+      </w:tr>
+      <w:tr>
+        <w:trPr>
+          <w:jc w:val="center"/>
+        </w:trPr>
+        <w:tc>
+          <w:tcPr>
+            <w:tcW w:w="3120" w:type="dxa"/>
+          </w:tcPr>
+          <w:p>
+            <w:r>
+              <w:t>Greedy single-gameweek</w:t>
+            </w:r>
+          </w:p>
+        </w:tc>
+        <w:tc>
+          <w:tcPr>
+            <w:tcW w:w="3120" w:type="dxa"/>
+          </w:tcPr>
+          <w:p>
+            <w:r>
+              <w:t>2,363</w:t>
+            </w:r>
+          </w:p>
+        </w:tc>
+        <w:tc>
+          <w:tcPr>
+            <w:tcW w:w="3120" w:type="dxa"/>
+          </w:tcPr>
+          <w:p>
+            <w:r>
+              <w:t>62.2</w:t>
+            </w:r>
+          </w:p>
+        </w:tc>
+      </w:tr>
+      <w:tr>
+        <w:trPr>
+          <w:jc w:val="center"/>
+        </w:trPr>
+        <w:tc>
+          <w:tcPr>
+            <w:tcW w:w="3120" w:type="dxa"/>
+          </w:tcPr>
+          <w:p>
+            <w:r>
+              <w:lastRenderedPageBreak/>
+              <w:t>4-GW horizon</w:t>
+            </w:r>
+          </w:p>
+        </w:tc>
+        <w:tc>
+          <w:tcPr>
+            <w:tcW w:w="3120" w:type="dxa"/>
+          </w:tcPr>
+          <w:p>
+            <w:r>
+              <w:t>2,735</w:t>
+            </w:r>
+          </w:p>
+        </w:tc>
+        <w:tc>
+          <w:tcPr>
+            <w:tcW w:w="3120" w:type="dxa"/>
+          </w:tcPr>
+          <w:p>
+            <w:r>
+              <w:t>72.0</w:t>
+            </w:r>
+          </w:p>
+        </w:tc>
+      </w:tr>
+    </w:tbl>
+    <w:p>
+      <w:r>
+        <w:t>The horizon mode recovers about 80% of the transfer friction lost by the greedy mode. The remaining 95-point gap to the fresh-squad upper bound is the genuine cost of having to commit to a fixed squad across the season.</w:t>
+      </w:r>
+    </w:p>
+    <w:p>
+      <w:r>
+        <w:rPr>
+          <w:b/>
+          <w:sz w:val="32"/>
+        </w:rPr>
+        <w:t>6. Live 2025/26 Season Simulation</w:t>
+      </w:r>
+    </w:p>
+    <w:p>
+      <w:r>
+        <w:t>The central question of the project — could the system have beaten human managers? — can only be answered by running the bot on the just-completed 2025/26 season. The 2025/26 dataset was rebuilt from scratch using the official FPL API: per-player history for all 841 players was fetched and pushed through the same feature pipeline as the historical data. The tuned decomposed network then produced per-gameweek predictions for the 4-GW horizon optimizer to consume. Without chips, the bot scored 2,384 points across the season — above the FPL global average of roughly 55-58 points per gameweek and roughly equivalent to rank 17,648 on the official Overall leaderboard (top 0.16% of ~11 million managers). Spearman correlation on the live season was 0.346 on played rows, slightly below the 0.369 on 2024/25 validation — expected, since 2025/26 was a lower-scoring season and the model had never seen it during training.</w:t>
+      </w:r>
+    </w:p>
+    <w:p>
+      <w:r>
+        <w:rPr>
+          <w:b/>
+          <w:sz w:val="32"/>
+        </w:rPr>
+        <w:t>7. Chip Strategy</w:t>
+      </w:r>
+    </w:p>
+    <w:p>
+      <w:r>
+        <w:t>The 2025/26 rules allow two of each chip — wildcard, free hit, bench boost, triple captain — one per season half. We implemented triple captain (TC), bench boost (BB), and wildcard (WC); free hit was deferred. Deployment gameweeks were chosen by a greedy heuristic search over the baseline backtest: TC at the gameweek with the highest predicted captain points, BB at the gameweek with the highest predicted bench score, WC at the gameweek where the current squad lagged the predicted fresh optimum by the most. The search prevents stacking two chips in the same gameweek. An oracle schedule was also computed using actual realised points, as a perfect-information upper bound.</w:t>
+      </w:r>
+    </w:p>
+    <w:p>
+      <w:r>
+        <w:rPr>
+          <w:i/>
+        </w:rPr>
+        <w:t>Table 3. 2025/26 Live Simulation Results vs FPL Overall Leaderboard (~11M managers).</w:t>
+      </w:r>
+    </w:p>
+    <w:tbl>
+      <w:tblPr>
+        <w:tblW w:w="0" w:type="auto"/>
+        <w:jc w:val="center"/>
+        <w:tblLook w:val="04A0" w:firstRow="1" w:lastRow="0" w:firstColumn="1" w:lastColumn="0" w:noHBand="0" w:noVBand="1"/>
+      </w:tblPr>
+      <w:tblGrid>
+        <w:gridCol w:w="2340"/>
+        <w:gridCol w:w="2340"/>
+        <w:gridCol w:w="2340"/>
+        <w:gridCol w:w="2340"/>
+      </w:tblGrid>
+      <w:tr>
+        <w:trPr>
+          <w:jc w:val="center"/>
+        </w:trPr>
+        <w:tc>
+          <w:tcPr>
+            <w:tcW w:w="2340" w:type="dxa"/>
+          </w:tcPr>
+          <w:p>
+            <w:r>
+              <w:rPr>
+                <w:b/>
+              </w:rPr>
+              <w:t>Configuration</w:t>
+            </w:r>
+          </w:p>
+        </w:tc>
+        <w:tc>
+          <w:tcPr>
+            <w:tcW w:w="2340" w:type="dxa"/>
+          </w:tcPr>
+          <w:p>
+            <w:r>
+              <w:rPr>
+                <w:b/>
+              </w:rPr>
+              <w:t>Net total</w:t>
+            </w:r>
+          </w:p>
+        </w:tc>
+        <w:tc>
+          <w:tcPr>
+            <w:tcW w:w="2340" w:type="dxa"/>
+          </w:tcPr>
+          <w:p>
+            <w:r>
+              <w:rPr>
+                <w:b/>
+              </w:rPr>
+              <w:t>vs top human</w:t>
+            </w:r>
+          </w:p>
+        </w:tc>
+        <w:tc>
+          <w:tcPr>
+            <w:tcW w:w="2340" w:type="dxa"/>
+          </w:tcPr>
+          <w:p>
+            <w:r>
+              <w:rPr>
+                <w:b/>
+              </w:rPr>
+              <w:t>Approx. global rank</w:t>
+            </w:r>
+          </w:p>
+        </w:tc>
+      </w:tr>
+      <w:tr>
+        <w:trPr>
+          <w:jc w:val="center"/>
+        </w:trPr>
+        <w:tc>
+          <w:tcPr>
+            <w:tcW w:w="2340" w:type="dxa"/>
+          </w:tcPr>
+          <w:p>
+            <w:r>
+              <w:t>No chips (baseline)</w:t>
+            </w:r>
+          </w:p>
+        </w:tc>
+        <w:tc>
+          <w:tcPr>
+            <w:tcW w:w="2340" w:type="dxa"/>
+          </w:tcPr>
+          <w:p>
+            <w:r>
+              <w:t>2,384</w:t>
+            </w:r>
+          </w:p>
+        </w:tc>
+        <w:tc>
+          <w:tcPr>
+            <w:tcW w:w="2340" w:type="dxa"/>
+          </w:tcPr>
+          <w:p>
+            <w:r>
+              <w:t>-198</w:t>
+            </w:r>
+          </w:p>
+        </w:tc>
+        <w:tc>
+          <w:tcPr>
+            <w:tcW w:w="2340" w:type="dxa"/>
+          </w:tcPr>
+          <w:p>
+            <w:r>
+              <w:t>~17,648</w:t>
+            </w:r>
+          </w:p>
+        </w:tc>
+      </w:tr>
+      <w:tr>
+        <w:trPr>
+          <w:jc w:val="center"/>
+        </w:trPr>
+        <w:tc>
+          <w:tcPr>
+            <w:tcW w:w="2340" w:type="dxa"/>
+          </w:tcPr>
+          <w:p>
+            <w:r>
+              <w:t>Heuristic TC + BB only</w:t>
+            </w:r>
+          </w:p>
+        </w:tc>
+        <w:tc>
+          <w:tcPr>
+            <w:tcW w:w="2340" w:type="dxa"/>
+          </w:tcPr>
+          <w:p>
+            <w:r>
+              <w:t>2,440</w:t>
+            </w:r>
+          </w:p>
+        </w:tc>
+        <w:tc>
+          <w:tcPr>
+            <w:tcW w:w="2340" w:type="dxa"/>
+          </w:tcPr>
+          <w:p>
+            <w:r>
+              <w:t>-142</w:t>
+            </w:r>
+          </w:p>
+        </w:tc>
+        <w:tc>
+          <w:tcPr>
+            <w:tcW w:w="2340" w:type="dxa"/>
+          </w:tcPr>
+          <w:p>
+            <w:r>
+              <w:t>~1,495</w:t>
+            </w:r>
+          </w:p>
+        </w:tc>
+      </w:tr>
+      <w:tr>
+        <w:trPr>
+          <w:jc w:val="center"/>
+        </w:trPr>
+        <w:tc>
+          <w:tcPr>
+            <w:tcW w:w="2340" w:type="dxa"/>
+          </w:tcPr>
+          <w:p>
+            <w:r>
+              <w:t>Heuristic TC + BB + WC</w:t>
+            </w:r>
+          </w:p>
+        </w:tc>
+        <w:tc>
+          <w:tcPr>
+            <w:tcW w:w="2340" w:type="dxa"/>
+          </w:tcPr>
+          <w:p>
+            <w:r>
+              <w:t>2,463</w:t>
+            </w:r>
+          </w:p>
+        </w:tc>
+        <w:tc>
+          <w:tcPr>
+            <w:tcW w:w="2340" w:type="dxa"/>
+          </w:tcPr>
+          <w:p>
+            <w:r>
+              <w:t>-119</w:t>
+            </w:r>
+          </w:p>
+        </w:tc>
+        <w:tc>
+          <w:tcPr>
+            <w:tcW w:w="2340" w:type="dxa"/>
+          </w:tcPr>
+          <w:p>
+            <w:r>
+              <w:t>~450</w:t>
+            </w:r>
+          </w:p>
+        </w:tc>
+      </w:tr>
+      <w:tr>
+        <w:trPr>
+          <w:jc w:val="center"/>
+        </w:trPr>
+        <w:tc>
+          <w:tcPr>
+            <w:tcW w:w="2340" w:type="dxa"/>
+          </w:tcPr>
+          <w:p>
+            <w:r>
+              <w:t xml:space="preserve">Oracle (perfect </w:t>
+            </w:r>
+            <w:r>
+              <w:lastRenderedPageBreak/>
+              <w:t>timing)</w:t>
+            </w:r>
+          </w:p>
+        </w:tc>
+        <w:tc>
+          <w:tcPr>
+            <w:tcW w:w="2340" w:type="dxa"/>
+          </w:tcPr>
+          <w:p>
+            <w:r>
+              <w:lastRenderedPageBreak/>
+              <w:t>2,522</w:t>
+            </w:r>
+          </w:p>
+        </w:tc>
+        <w:tc>
+          <w:tcPr>
+            <w:tcW w:w="2340" w:type="dxa"/>
+          </w:tcPr>
+          <w:p>
+            <w:r>
+              <w:t>-60</w:t>
+            </w:r>
+          </w:p>
+        </w:tc>
+        <w:tc>
+          <w:tcPr>
+            <w:tcW w:w="2340" w:type="dxa"/>
+          </w:tcPr>
+          <w:p>
+            <w:r>
+              <w:t>~15</w:t>
+            </w:r>
+          </w:p>
+        </w:tc>
+      </w:tr>
+    </w:tbl>
+    <w:p>
+      <w:r>
+        <w:t>The heuristic schedule recovers 57% of the oracle's chip uplift. The missing 60 points come almost entirely from poor chip timing — the heuristic deployed triple captain in gameweek 1, while the oracle would have waited until gameweek 6 when the captain actually hauled. The 79-point uplift from chips moves the bot from rank 17,648 (no chips) to rank ~450 on the live Overall leaderboard — a jump of roughly 17,200 places, and into the top 0.005% globally.</w:t>
+      </w:r>
+    </w:p>
+    <w:p>
+      <w:r>
+        <w:rPr>
+          <w:b/>
+          <w:sz w:val="32"/>
+        </w:rPr>
+        <w:t>8. Feature Ablation Study</w:t>
+      </w:r>
+    </w:p>
+    <w:p>
+      <w:r>
+        <w:t>To quantify which feature groups actually contribute, the tuned decomposed network was retrained eight times, each time with one named group dropped. All other training hyperparameters were held constant. The deltas in Table 4 are computed against the full-feature baseline.</w:t>
+      </w:r>
+    </w:p>
+    <w:p>
+      <w:r>
+        <w:rPr>
+          <w:i/>
+        </w:rPr>
+        <w:t>Table 4. Feature-Group Ablation Results (delta vs full-feature baseline).</w:t>
+      </w:r>
+    </w:p>
+    <w:tbl>
+      <w:tblPr>
+        <w:tblW w:w="0" w:type="auto"/>
+        <w:jc w:val="center"/>
+        <w:tblLook w:val="04A0" w:firstRow="1" w:lastRow="0" w:firstColumn="1" w:lastColumn="0" w:noHBand="0" w:noVBand="1"/>
+      </w:tblPr>
+      <w:tblGrid>
+        <w:gridCol w:w="2340"/>
+        <w:gridCol w:w="2340"/>
+        <w:gridCol w:w="2340"/>
+        <w:gridCol w:w="2340"/>
+      </w:tblGrid>
+      <w:tr>
+        <w:trPr>
+          <w:jc w:val="center"/>
+        </w:trPr>
+        <w:tc>
+          <w:tcPr>
+            <w:tcW w:w="2340" w:type="dxa"/>
+          </w:tcPr>
+          <w:p>
+            <w:r>
+              <w:rPr>
+                <w:b/>
+              </w:rPr>
+              <w:t>Dropped group</w:t>
+            </w:r>
+          </w:p>
+        </w:tc>
+        <w:tc>
+          <w:tcPr>
+            <w:tcW w:w="2340" w:type="dxa"/>
+          </w:tcPr>
+          <w:p>
+            <w:r>
+              <w:rPr>
+                <w:b/>
+              </w:rPr>
+              <w:t>Δ ρ (played)</w:t>
+            </w:r>
+          </w:p>
+        </w:tc>
+        <w:tc>
+          <w:tcPr>
+            <w:tcW w:w="2340" w:type="dxa"/>
+          </w:tcPr>
+          <w:p>
+            <w:r>
+              <w:rPr>
+                <w:b/>
+              </w:rPr>
+              <w:t>Δ ρ (all)</w:t>
+            </w:r>
+          </w:p>
+        </w:tc>
+        <w:tc>
+          <w:tcPr>
+            <w:tcW w:w="2340" w:type="dxa"/>
+          </w:tcPr>
+          <w:p>
+            <w:r>
+              <w:rPr>
+                <w:b/>
+              </w:rPr>
+              <w:t>Notes</w:t>
+            </w:r>
+          </w:p>
+        </w:tc>
+      </w:tr>
+      <w:tr>
+        <w:trPr>
+          <w:jc w:val="center"/>
+        </w:trPr>
+        <w:tc>
+          <w:tcPr>
+            <w:tcW w:w="2340" w:type="dxa"/>
+          </w:tcPr>
+          <w:p>
+            <w:r>
+              <w:t>player_form (12 cols)</w:t>
+            </w:r>
+          </w:p>
+        </w:tc>
+        <w:tc>
+          <w:tcPr>
+            <w:tcW w:w="2340" w:type="dxa"/>
+          </w:tcPr>
+          <w:p>
+            <w:r>
+              <w:t>-0.029</w:t>
+            </w:r>
+          </w:p>
+        </w:tc>
+        <w:tc>
+          <w:tcPr>
+            <w:tcW w:w="2340" w:type="dxa"/>
+          </w:tcPr>
+          <w:p>
+            <w:r>
+              <w:t>-0.068</w:t>
+            </w:r>
+          </w:p>
+        </w:tc>
+        <w:tc>
+          <w:tcPr>
+            <w:tcW w:w="2340" w:type="dxa"/>
+          </w:tcPr>
+          <w:p>
+            <w:r>
+              <w:t>Dominant signal</w:t>
+            </w:r>
+          </w:p>
+        </w:tc>
+      </w:tr>
+      <w:tr>
+        <w:trPr>
+          <w:jc w:val="center"/>
+        </w:trPr>
+        <w:tc>
+          <w:tcPr>
+            <w:tcW w:w="2340" w:type="dxa"/>
+          </w:tcPr>
+          <w:p>
+            <w:r>
+              <w:t>market_signals (5 cols)</w:t>
+            </w:r>
+          </w:p>
+        </w:tc>
+        <w:tc>
+          <w:tcPr>
+            <w:tcW w:w="2340" w:type="dxa"/>
+          </w:tcPr>
+          <w:p>
+            <w:r>
+              <w:t>-0.004</w:t>
+            </w:r>
+          </w:p>
+        </w:tc>
+        <w:tc>
+          <w:tcPr>
+            <w:tcW w:w="2340" w:type="dxa"/>
+          </w:tcPr>
+          <w:p>
+            <w:r>
+              <w:t>-0.005</w:t>
+            </w:r>
+          </w:p>
+        </w:tc>
+        <w:tc>
+          <w:tcPr>
+            <w:tcW w:w="2340" w:type="dxa"/>
+          </w:tcPr>
+          <w:p>
+            <w:r>
+              <w:t>Small contribution</w:t>
+            </w:r>
+          </w:p>
+        </w:tc>
+      </w:tr>
+      <w:tr>
+        <w:trPr>
+          <w:jc w:val="center"/>
+        </w:trPr>
+        <w:tc>
+          <w:tcPr>
+            <w:tcW w:w="2340" w:type="dxa"/>
+          </w:tcPr>
+          <w:p>
+            <w:r>
+              <w:t>opponent_strength (2 cols)</w:t>
+            </w:r>
+          </w:p>
+        </w:tc>
+        <w:tc>
+          <w:tcPr>
+            <w:tcW w:w="2340" w:type="dxa"/>
+          </w:tcPr>
+          <w:p>
+            <w:r>
+              <w:t>-0.002</w:t>
+            </w:r>
+          </w:p>
+        </w:tc>
+        <w:tc>
+          <w:tcPr>
+            <w:tcW w:w="2340" w:type="dxa"/>
+          </w:tcPr>
+          <w:p>
+            <w:r>
+              <w:t>-0.002</w:t>
+            </w:r>
+          </w:p>
+        </w:tc>
+        <w:tc>
+          <w:tcPr>
+            <w:tcW w:w="2340" w:type="dxa"/>
+          </w:tcPr>
+          <w:p>
+            <w:r>
+              <w:t>Within noise</w:t>
+            </w:r>
+          </w:p>
+        </w:tc>
+      </w:tr>
+      <w:tr>
+        <w:trPr>
+          <w:jc w:val="center"/>
+        </w:trPr>
+        <w:tc>
+          <w:tcPr>
+            <w:tcW w:w="2340" w:type="dxa"/>
+          </w:tcPr>
+          <w:p>
+            <w:r>
+              <w:t>position_id / promoted_flag</w:t>
+            </w:r>
+          </w:p>
+        </w:tc>
+        <w:tc>
+          <w:tcPr>
+            <w:tcW w:w="2340" w:type="dxa"/>
+          </w:tcPr>
+          <w:p>
+            <w:r>
+              <w:t>≈ -0.001</w:t>
+            </w:r>
+          </w:p>
+        </w:tc>
+        <w:tc>
+          <w:tcPr>
+            <w:tcW w:w="2340" w:type="dxa"/>
+          </w:tcPr>
+          <w:p>
+            <w:r>
+              <w:t>≈ -0.003</w:t>
+            </w:r>
+          </w:p>
+        </w:tc>
+        <w:tc>
+          <w:tcPr>
+            <w:tcW w:w="2340" w:type="dxa"/>
+          </w:tcPr>
+          <w:p>
+            <w:r>
+              <w:t>Within noise</w:t>
+            </w:r>
+          </w:p>
+        </w:tc>
+      </w:tr>
+      <w:tr>
+        <w:trPr>
+          <w:jc w:val="center"/>
+        </w:trPr>
+        <w:tc>
+          <w:tcPr>
+            <w:tcW w:w="2340" w:type="dxa"/>
+          </w:tcPr>
+          <w:p>
+            <w:r>
+              <w:t>anchors / team_form / fixture_context</w:t>
+            </w:r>
+          </w:p>
+        </w:tc>
+        <w:tc>
+          <w:tcPr>
+            <w:tcW w:w="2340" w:type="dxa"/>
+          </w:tcPr>
+          <w:p>
+            <w:r>
+              <w:t>0 to +0.004</w:t>
+            </w:r>
+          </w:p>
+        </w:tc>
+        <w:tc>
+          <w:tcPr>
+            <w:tcW w:w="2340" w:type="dxa"/>
+          </w:tcPr>
+          <w:p>
+            <w:r>
+              <w:t>-0.005 to +0.002</w:t>
+            </w:r>
+          </w:p>
+        </w:tc>
+        <w:tc>
+          <w:tcPr>
+            <w:tcW w:w="2340" w:type="dxa"/>
+          </w:tcPr>
+          <w:p>
+            <w:r>
+              <w:t>≈ neutral</w:t>
+            </w:r>
+          </w:p>
+        </w:tc>
+      </w:tr>
+    </w:tbl>
+    <w:p>
+      <w:r>
+        <w:t>One finding dominates: the rolling player-form features (recent points, minutes, goals, assists, expected goals, expected assists over the last three and five gameweeks) carry almost all of the model's predictive power. Dropping them costs roughly ten times as much Spearman correlation as dropping any other group. Most other deltas are within the run-to-run training variance (~±0.003-0.005) and should be read as approximately neutral.</w:t>
+      </w:r>
+    </w:p>
+    <w:p>
+      <w:r>
+        <w:rPr>
+          <w:b/>
+          <w:sz w:val="32"/>
+        </w:rPr>
+        <w:t>9. Conclusion</w:t>
+      </w:r>
+    </w:p>
+    <w:p>
+      <w:r>
+        <w:t xml:space="preserve">On the live 2025/26 season the system scored 2,463 points, which equates to approximately rank 450 on the official FPL Overall leaderboard — within the top 0.005% out of roughly 11 </w:t>
+      </w:r>
+      <w:r>
+        <w:lastRenderedPageBreak/>
+        <w:t>million human managers. The ablations indicate that the largest remaining gains lie in prediction quality — particularly richer rolling-form signals — rather than in optimization.</w:t>
+      </w:r>
     </w:p>
     <w:sectPr>
       <w:pgSz w:w="12240" w:h="15840"/>
-      <w:pgMar w:top="1440" w:right="1800" w:bottom="1440" w:left="1800" w:header="720" w:footer="720" w:gutter="0"/>
+      <w:pgMar w:top="1152" w:right="1440" w:bottom="1152" w:left="1440" w:header="720" w:footer="720" w:gutter="0"/>
       <w:cols w:space="720"/>
       <w:docGrid w:linePitch="360"/>
     </w:sectPr>
@@ -2895,6 +3724,7 @@
   <w:style w:type="character" w:default="1" w:styleId="DefaultParagraphFont">
     <w:name w:val="Default Paragraph Font"/>
     <w:uiPriority w:val="1"/>
+    <w:semiHidden/>
     <w:unhideWhenUsed/>
   </w:style>
   <w:style w:type="table" w:default="1" w:styleId="TableNormal">

</xml_diff>